<commit_message>
added pdf version and updated info
</commit_message>
<xml_diff>
--- a/docs/Proposal.docx
+++ b/docs/Proposal.docx
@@ -260,8 +260,6 @@
         </w:rPr>
         <w:t>Audio machine</w:t>
       </w:r>
-      <w:bookmarkStart w:id="0" w:name="_GoBack"/>
-      <w:bookmarkEnd w:id="0"/>
     </w:p>
     <w:p>
       <w:pPr>
@@ -321,8 +319,10 @@
         <w:rPr>
           <w:rFonts w:ascii="Segoe UI Symbol" w:hAnsi="Segoe UI Symbol" w:cs="Segoe UI Symbol"/>
         </w:rPr>
-        <w:t>NetBeans</w:t>
-      </w:r>
+        <w:t>Android Studio</w:t>
+      </w:r>
+      <w:bookmarkStart w:id="0" w:name="_GoBack"/>
+      <w:bookmarkEnd w:id="0"/>
     </w:p>
     <w:p>
       <w:pPr>

</xml_diff>